<commit_message>
Update translation and nested table reconstruction
</commit_message>
<xml_diff>
--- a/backend/outputs/nested_table_reconstructed_hi.docx
+++ b/backend/outputs/nested_table_reconstructed_hi.docx
@@ -4,7 +4,7 @@
   <w:body>
     <w:p>
       <w:pPr>
-        <w:jc w:val="center"/>
+        <w:jc w:val="left"/>
         <w:rPr>
           <w:b/>
           <w:bCs/>
@@ -14,12 +14,83 @@
       </w:pPr>
       <w:r>
         <w:rPr>
+          <w:rFonts w:cs="Nirmala UI" w:eastAsia="Nirmala UI"/>
           <w:b/>
           <w:sz w:val="40"/>
           <w:bCs w:val="1"/>
           <w:szCs w:val="40"/>
         </w:rPr>
-        <w:t>NESTED TABLE SAMPLE DOCUMENT</w:t>
+        <w:t>एन</w:t>
+      </w:r>
+      <w:r>
+        <w:rPr>
+          <w:rFonts w:cs="Nirmala UI" w:eastAsia="Nirmala UI"/>
+          <w:b/>
+          <w:sz w:val="40"/>
+          <w:bCs w:val="1"/>
+          <w:szCs w:val="40"/>
+        </w:rPr>
+        <w:t>निहित</w:t>
+      </w:r>
+      <w:r>
+        <w:rPr>
+          <w:rFonts w:cs="Nirmala UI" w:eastAsia="Nirmala UI"/>
+          <w:b/>
+          <w:sz w:val="40"/>
+          <w:bCs w:val="1"/>
+          <w:szCs w:val="40"/>
+        </w:rPr>
+        <w:t xml:space="preserve"> टी</w:t>
+      </w:r>
+      <w:r>
+        <w:rPr>
+          <w:rFonts w:cs="Nirmala UI" w:eastAsia="Nirmala UI"/>
+          <w:b/>
+          <w:sz w:val="40"/>
+          <w:bCs w:val="1"/>
+          <w:szCs w:val="40"/>
+        </w:rPr>
+        <w:t>सक्षम</w:t>
+      </w:r>
+      <w:r>
+        <w:rPr>
+          <w:rFonts w:cs="Nirmala UI" w:eastAsia="Nirmala UI"/>
+          <w:b/>
+          <w:sz w:val="40"/>
+          <w:bCs w:val="1"/>
+          <w:szCs w:val="40"/>
+        </w:rPr>
+        <w:t xml:space="preserve"> एस</w:t>
+      </w:r>
+      <w:r>
+        <w:rPr>
+          <w:rFonts w:cs="Nirmala UI" w:eastAsia="Nirmala UI"/>
+          <w:b/>
+          <w:sz w:val="40"/>
+          <w:bCs w:val="1"/>
+          <w:szCs w:val="40"/>
+        </w:rPr>
+        <w:t>पर्याप्त</w:t>
+      </w:r>
+      <w:r>
+        <w:rPr>
+          <w:rFonts w:cs="Nirmala UI" w:eastAsia="Nirmala UI"/>
+          <w:b/>
+          <w:sz w:val="40"/>
+          <w:bCs w:val="1"/>
+          <w:szCs w:val="40"/>
+        </w:rPr>
+        <w:t xml:space="preserve"> डी</w:t>
+      </w:r>
+      <w:r>
+        <w:rPr>
+          <w:rFonts w:cs="Nirmala UI" w:eastAsia="Nirmala UI"/>
+          <w:b/>
+          <w:sz w:val="40"/>
+          <w:bCs w:val="1"/>
+          <w:szCs w:val="40"/>
+        </w:rPr>
+        <w:t>उदासीनता</w:t>
       </w:r>
     </w:p>
     <w:p>
@@ -1309,6 +1380,7 @@
   <w:style w:type="character" w:default="1" w:styleId="DefaultParagraphFont">
     <w:name w:val="Default Paragraph Font"/>
     <w:uiPriority w:val="1"/>
+    <w:semiHidden/>
     <w:unhideWhenUsed/>
   </w:style>
   <w:style w:type="table" w:default="1" w:styleId="TableNormal">

</xml_diff>

<commit_message>
Add PPT text extraction implementation
</commit_message>
<xml_diff>
--- a/backend/outputs/nested_table_reconstructed_hi.docx
+++ b/backend/outputs/nested_table_reconstructed_hi.docx
@@ -16,8 +16,8 @@
         <w:rPr>
           <w:rFonts w:cs="Nirmala UI" w:eastAsia="Nirmala UI"/>
           <w:b/>
+          <w:bCs/>
           <w:sz w:val="40"/>
-          <w:bCs w:val="1"/>
           <w:szCs w:val="40"/>
         </w:rPr>
         <w:t>एन</w:t>
@@ -26,28 +26,37 @@
         <w:rPr>
           <w:rFonts w:cs="Nirmala UI" w:eastAsia="Nirmala UI"/>
           <w:b/>
+          <w:bCs/>
           <w:sz w:val="40"/>
-          <w:bCs w:val="1"/>
           <w:szCs w:val="40"/>
         </w:rPr>
         <w:t>निहित</w:t>
       </w:r>
       <w:r>
         <w:rPr>
-          <w:rFonts w:cs="Nirmala UI" w:eastAsia="Nirmala UI"/>
           <w:b/>
+          <w:bCs/>
           <w:sz w:val="40"/>
-          <w:bCs w:val="1"/>
           <w:szCs w:val="40"/>
         </w:rPr>
-        <w:t xml:space="preserve"> टी</w:t>
+        <w:t xml:space="preserve"> </w:t>
       </w:r>
       <w:r>
         <w:rPr>
           <w:rFonts w:cs="Nirmala UI" w:eastAsia="Nirmala UI"/>
           <w:b/>
+          <w:bCs/>
           <w:sz w:val="40"/>
-          <w:bCs w:val="1"/>
+          <w:szCs w:val="40"/>
+        </w:rPr>
+        <w:t>टी</w:t>
+      </w:r>
+      <w:r>
+        <w:rPr>
+          <w:rFonts w:cs="Nirmala UI" w:eastAsia="Nirmala UI"/>
+          <w:b/>
+          <w:bCs/>
+          <w:sz w:val="40"/>
           <w:szCs w:val="40"/>
         </w:rPr>
         <w:t>सक्षम</w:t>
@@ -56,8 +65,8 @@
         <w:rPr>
           <w:rFonts w:cs="Nirmala UI" w:eastAsia="Nirmala UI"/>
           <w:b/>
+          <w:bCs/>
           <w:sz w:val="40"/>
-          <w:bCs w:val="1"/>
           <w:szCs w:val="40"/>
         </w:rPr>
         <w:t xml:space="preserve"> एस</w:t>
@@ -66,8 +75,8 @@
         <w:rPr>
           <w:rFonts w:cs="Nirmala UI" w:eastAsia="Nirmala UI"/>
           <w:b/>
+          <w:bCs/>
           <w:sz w:val="40"/>
-          <w:bCs w:val="1"/>
           <w:szCs w:val="40"/>
         </w:rPr>
         <w:t>पर्याप्त</w:t>
@@ -76,8 +85,8 @@
         <w:rPr>
           <w:rFonts w:cs="Nirmala UI" w:eastAsia="Nirmala UI"/>
           <w:b/>
+          <w:bCs/>
           <w:sz w:val="40"/>
-          <w:bCs w:val="1"/>
           <w:szCs w:val="40"/>
         </w:rPr>
         <w:t xml:space="preserve"> डी</w:t>
@@ -86,8 +95,8 @@
         <w:rPr>
           <w:rFonts w:cs="Nirmala UI" w:eastAsia="Nirmala UI"/>
           <w:b/>
+          <w:bCs/>
           <w:sz w:val="40"/>
-          <w:bCs w:val="1"/>
           <w:szCs w:val="40"/>
         </w:rPr>
         <w:t>उदासीनता</w:t>
@@ -204,7 +213,7 @@
       </w:tr>
       <w:tr>
         <w:trPr>
-          <w:trHeight w:val="2529"/>
+          <w:trHeight w:val="2671"/>
         </w:trPr>
         <w:tc>
           <w:tcPr>
@@ -500,7 +509,7 @@
       </w:tr>
       <w:tr>
         <w:trPr>
-          <w:trHeight w:val="2275"/>
+          <w:trHeight w:val="2553"/>
         </w:trPr>
         <w:tc>
           <w:tcPr>

</xml_diff>